<commit_message>
Manuscript v8: state the compound attrition chain, final consistency pass
Adds an explicit statement of how 241 assembled compounds reduce to the two analysed sets: 235
carry a measured affinity, 234 survive the unrelieved-clash screen and are used for the
correlation analyses, and 220 remain after additionally excluding censored measurements and are
used for the pairwise analyses. Every reported n now refers to one of those two sets. The
attrition was previously scattered across three sentences and one figure caption.

Final sweep found no contradictions: every key statistic appears consistently across abstract,
results, discussion and limitations; all significance claims match the corrected compound-level
intervals; no unhedged causal account of why the method works on PCSK9 survives.

Audit: 7 tables and 4 figures in document order, 19 references all cited and defined, 28
sections with no dangling cross-references, 9,287 words.

Co-Authored-By: Claude Opus 5 <noreply@anthropic.com>
</commit_message>
<xml_diff>
--- a/manuscript/MANUSCRIPT.docx
+++ b/manuscript/MANUSCRIPT.docx
@@ -1118,19 +1118,13 @@
         <w:t xml:space="preserve"> </w:t>
       </w:r>
       <w:r>
-        <w:t xml:space="preserve">We use the 241 compounds for which structures and labels could be assembled; 235</w:t>
-      </w:r>
-      <w:r>
-        <w:t xml:space="preserve"> </w:t>
-      </w:r>
-      <w:r>
-        <w:t xml:space="preserve">carry an experimental binding free energy and 234 survive quality control (Section 2.4).</w:t>
-      </w:r>
-      <w:r>
-        <w:t xml:space="preserve"> </w:t>
-      </w:r>
-      <w:r>
-        <w:t xml:space="preserve">Analyses requiring unambiguous labels additionally exclude censored measurements, leaving 220.</w:t>
+        <w:t xml:space="preserve">We use the 241 compounds for which structures and labels could be assembled; the</w:t>
+      </w:r>
+      <w:r>
+        <w:t xml:space="preserve"> </w:t>
+      </w:r>
+      <w:r>
+        <w:t xml:space="preserve">attrition to the analysed sets is given below.</w:t>
       </w:r>
     </w:p>
     <w:p>
@@ -1157,6 +1151,121 @@
       </w:r>
       <w:r>
         <w:t xml:space="preserve">difficult to obtain.</w:t>
+      </w:r>
+    </w:p>
+    <w:p>
+      <w:pPr>
+        <w:pStyle w:val="BodyText"/>
+      </w:pPr>
+      <w:r>
+        <w:rPr>
+          <w:b/>
+          <w:bCs/>
+        </w:rPr>
+        <w:t xml:space="preserve">Compound attrition, stated once for reproducibility.</w:t>
+      </w:r>
+      <w:r>
+        <w:t xml:space="preserve"> </w:t>
+      </w:r>
+      <w:r>
+        <w:t xml:space="preserve">Of the 241 compounds for which</w:t>
+      </w:r>
+      <w:r>
+        <w:t xml:space="preserve"> </w:t>
+      </w:r>
+      <w:r>
+        <w:t xml:space="preserve">structures and labels could be assembled,</w:t>
+      </w:r>
+      <w:r>
+        <w:t xml:space="preserve"> </w:t>
+      </w:r>
+      <w:r>
+        <w:rPr>
+          <w:b/>
+          <w:bCs/>
+        </w:rPr>
+        <w:t xml:space="preserve">235</w:t>
+      </w:r>
+      <w:r>
+        <w:t xml:space="preserve"> </w:t>
+      </w:r>
+      <w:r>
+        <w:t xml:space="preserve">carry an experimental binding free energy;</w:t>
+      </w:r>
+      <w:r>
+        <w:t xml:space="preserve"> </w:t>
+      </w:r>
+      <w:r>
+        <w:rPr>
+          <w:b/>
+          <w:bCs/>
+        </w:rPr>
+        <w:t xml:space="preserve">234</w:t>
+      </w:r>
+      <w:r>
+        <w:t xml:space="preserve"> </w:t>
+      </w:r>
+      <w:r>
+        <w:t xml:space="preserve">remain after excluding</w:t>
+      </w:r>
+      <w:r>
+        <w:t xml:space="preserve"> </w:t>
+      </w:r>
+      <w:r>
+        <w:rPr>
+          <w:rStyle w:val="VerbatimChar"/>
+        </w:rPr>
+        <w:t xml:space="preserve">MCL_1__cpd_55</w:t>
+      </w:r>
+      <w:r>
+        <w:t xml:space="preserve"> </w:t>
+      </w:r>
+      <w:r>
+        <w:t xml:space="preserve">for an unrelieved steric clash (Section 2.2); and</w:t>
+      </w:r>
+      <w:r>
+        <w:t xml:space="preserve"> </w:t>
+      </w:r>
+      <w:r>
+        <w:rPr>
+          <w:b/>
+          <w:bCs/>
+        </w:rPr>
+        <w:t xml:space="preserve">220</w:t>
+      </w:r>
+      <w:r>
+        <w:t xml:space="preserve"> </w:t>
+      </w:r>
+      <w:r>
+        <w:t xml:space="preserve">remain for the pairwise analyses, which additionally exclude censored measurements</w:t>
+      </w:r>
+      <w:r>
+        <w:t xml:space="preserve"> </w:t>
+      </w:r>
+      <w:r>
+        <w:t xml:space="preserve">because the ordering of a censored pair is ambiguous. Correlation analyses in §3.1–3.3 use the</w:t>
+      </w:r>
+      <w:r>
+        <w:t xml:space="preserve"> </w:t>
+      </w:r>
+      <w:r>
+        <w:t xml:space="preserve">234; pairwise analyses in §3.4 use the 220. Every reported</w:t>
+      </w:r>
+      <w:r>
+        <w:t xml:space="preserve"> </w:t>
+      </w:r>
+      <w:r>
+        <w:rPr>
+          <w:i/>
+          <w:iCs/>
+        </w:rPr>
+        <w:t xml:space="preserve">n</w:t>
+      </w:r>
+      <w:r>
+        <w:t xml:space="preserve"> </w:t>
+      </w:r>
+      <w:r>
+        <w:t xml:space="preserve">refers to one of these two sets.</w:t>
       </w:r>
     </w:p>
     <w:p>

</xml_diff>

<commit_message>
Manuscript v11: single title
A thesis-style document carries one title, not a title plus an inline alternative. Kept the
methods-forward title, consistent with the methods being the contribution; the results-forward
wording is recorded in this message should it be preferred:

  'Size-matched benchmarking reveals genuine but modest ranking skill in end-point MM/PBSA for
   macrocyclic peptides'

Co-Authored-By: Claude Opus 5 <noreply@anthropic.com>
</commit_message>
<xml_diff>
--- a/manuscript/MANUSCRIPT.docx
+++ b/manuscript/MANUSCRIPT.docx
@@ -40,74 +40,6 @@
     <w:p>
       <w:pPr>
         <w:pStyle w:val="FirstParagraph"/>
-      </w:pPr>
-      <w:r>
-        <w:rPr>
-          <w:i/>
-          <w:iCs/>
-        </w:rPr>
-        <w:t xml:space="preserve">Alternative title, results-forward:</w:t>
-      </w:r>
-      <w:r>
-        <w:rPr>
-          <w:i/>
-          <w:iCs/>
-        </w:rPr>
-        <w:t xml:space="preserve"> </w:t>
-      </w:r>
-      <w:r>
-        <w:rPr>
-          <w:i/>
-          <w:iCs/>
-        </w:rPr>
-        <w:t xml:space="preserve">“Size-matched benchmarking reveals genuine but modest</w:t>
-      </w:r>
-      <w:r>
-        <w:rPr>
-          <w:i/>
-          <w:iCs/>
-        </w:rPr>
-        <w:t xml:space="preserve"> </w:t>
-      </w:r>
-      <w:r>
-        <w:rPr>
-          <w:i/>
-          <w:iCs/>
-        </w:rPr>
-        <w:t xml:space="preserve">ranking skill in end-point MM/PBSA for macrocyclic peptides.”</w:t>
-      </w:r>
-      <w:r>
-        <w:rPr>
-          <w:i/>
-          <w:iCs/>
-        </w:rPr>
-        <w:t xml:space="preserve"> </w:t>
-      </w:r>
-      <w:r>
-        <w:rPr>
-          <w:i/>
-          <w:iCs/>
-        </w:rPr>
-        <w:t xml:space="preserve">The methods-forward title above</w:t>
-      </w:r>
-      <w:r>
-        <w:rPr>
-          <w:i/>
-          <w:iCs/>
-        </w:rPr>
-        <w:t xml:space="preserve"> </w:t>
-      </w:r>
-      <w:r>
-        <w:rPr>
-          <w:i/>
-          <w:iCs/>
-        </w:rPr>
-        <w:t xml:space="preserve">reflects the paper’s purpose; either works.</w:t>
-      </w:r>
-    </w:p>
-    <w:p>
-      <w:pPr>
-        <w:pStyle w:val="BodyText"/>
       </w:pPr>
       <w:r>
         <w:rPr>

</xml_diff>